<commit_message>
Lito Sousa: revisão crítica da Parte 3
Co-Authored-By: Claude Opus 5.5 <noreply@anthropic.com>
Claude-Session: https://claude.ai/code/session_01MJjUEEZrxQDEUifKK2vj9g
</commit_message>
<xml_diff>
--- a/roteiros/lito-sousa/LitoSousa_Parte3.docx
+++ b/roteiros/lito-sousa/LitoSousa_Parte3.docx
@@ -95,7 +95,7 @@
         <w:rPr>
           <w:color w:val="1F4EB4"/>
         </w:rPr>
-        <w:t>Existe no corpo uma proteína chamada príon. Na doença de Creutzfeldt-Jakob, essa proteína ganha um formato errado. E a proteína defeituosa passa a deformar as outras que encontra pelo caminho.</w:t>
+        <w:t>Existe no cérebro uma proteína normal, que todo mundo tem. Na doença de Creutzfeldt-Jakob, uma parte dela ganha um formato errado. Essa forma defeituosa é chamada de príon. E o príon passa a deformar as outras proteínas que encontra pelo caminho.</w:t>
       </w:r>
     </w:p>
     <w:p>
@@ -119,7 +119,7 @@
         <w:rPr>
           <w:color w:val="1F4EB4"/>
         </w:rPr>
-        <w:t>Na nota divulgada pela família, a doença foi descrita com quatro palavras duras. Rara, degenerativa, progressiva e fatal.</w:t>
+        <w:t>Nas reportagens sobre o caso, a doença foi descrita com quatro palavras duras. Rara, degenerativa, progressiva e fatal.</w:t>
       </w:r>
     </w:p>
     <w:p>
@@ -143,7 +143,7 @@
         <w:rPr>
           <w:color w:val="1F4EB4"/>
         </w:rPr>
-        <w:t>Mila contou também o que os médicos tinham dito ao casal. Que Lito ainda estava lúcido, consciente, capaz de conversar. E que ele devia aproveitar aquela janela.</w:t>
+        <w:t>Mila contou também o que os médicos tinham dito ao casal. Que Lito ainda estava lúcido e conseguia conversar. E que ele devia aproveitar aquela janela.</w:t>
       </w:r>
     </w:p>
     <w:p>
@@ -159,7 +159,7 @@
         <w:rPr>
           <w:color w:val="000000"/>
         </w:rPr>
-        <w:t>A frase se espalhou pelo país em poucas horas.</w:t>
+        <w:t>A notícia se espalhou rapidamente.</w:t>
       </w:r>
     </w:p>
     <w:p>
@@ -231,7 +231,7 @@
         <w:rPr>
           <w:color w:val="000000"/>
         </w:rPr>
-        <w:t>Não foi uma alta de quem está curado. Ele foi para casa continuar os chamados cuidados paliativos. Um tipo de cuidado feito para aliviar o sofrimento quando a medicina ainda não tem como curar.</w:t>
+        <w:t>Ele foi para casa continuar os chamados cuidados paliativos. Um tipo de cuidado feito para aliviar o sofrimento quando a medicina ainda não tem como curar.</w:t>
       </w:r>
     </w:p>
     <w:p>
@@ -247,7 +247,7 @@
         <w:rPr>
           <w:color w:val="000000"/>
         </w:rPr>
-        <w:t>E foi de casa que Lito disse uma frase que muitos fãs nunca mais esqueceram.</w:t>
+        <w:t>E foi de casa que Lito disse uma frase que emocionou os fãs.</w:t>
       </w:r>
     </w:p>
     <w:p>

</xml_diff>